<commit_message>
feat: notebook d'exploration, données versionnées avec DVC, README final
- notebooks/01_exploration_entrainement.ipynb exécuté sur les 500 000 lignes :
  contrôle qualité, cible, variables par niveau de risque, prétraitements,
  entraînement, matrice de confusion, ROC, importance des variables,
  contrôle de non-fuite, simulation de dérive.
- DVC initialisé ; dvc repro génère dvc.lock (md5 des données, du code et
  des paramètres) et reproduit exactement les métriques (F1 0,580, AUC 0,746).
- README sans notes de travail : résultats, démarrage, structure, livrables.
- Rapport mis à jour (dvc.lock, notebook).

Co-Authored-By: Claude Opus 5.5 <noreply@anthropic.com>
Claude-Session: https://claude.ai/code/session_01NkcZkFFJM8FXKkCMTWAtpu
</commit_message>
<xml_diff>
--- a/docs/Rapport_MLOps_Impayes.docx
+++ b/docs/Rapport_MLOps_Impayes.docx
@@ -5998,7 +5998,7 @@
                 <w:sz w:val="19"/>
                 <w:szCs w:val="19"/>
               </w:rPr>
-              <w:t xml:space="preserve">https://github.com/djamilabeyas/mlops-impayes – src/ (data, train, api, monitoring), tests/, flows/, notebooks/, scripts/, monitoring/, registry/, docs/, README.md</w:t>
+              <w:t xml:space="preserve">https://github.com/djamilabeyas/mlops-impayes – src/ (data, train, api, monitoring), notebooks/01_exploration_entrainement.ipynb, tests/, flows/, scripts/, monitoring/, registry/, docs/, README.md</w:t>
             </w:r>
           </w:p>
         </w:tc>
@@ -6061,7 +6061,7 @@
                 <w:sz w:val="19"/>
                 <w:szCs w:val="19"/>
               </w:rPr>
-              <w:t xml:space="preserve">dvc.yaml, params.yaml ; prétraitements : cible high = 1, low/medium = 0 ; retrait de customer_id, phone_number, assessment_date ; imputation et encodage one-hot</w:t>
+              <w:t xml:space="preserve">dvc.yaml et dvc.lock (empreintes md5 des données, du code et des paramètres), params.yaml ; prétraitements : cible high = 1, low/medium = 0 ; retrait de customer_id, phone_number, assessment_date ; imputation et encodage one-hot</w:t>
             </w:r>
           </w:p>
         </w:tc>
@@ -6124,7 +6124,7 @@
                 <w:sz w:val="19"/>
                 <w:szCs w:val="19"/>
               </w:rPr>
-              <w:t xml:space="preserve">models/metrics.json, models/meta.json, artefact « model » de chaque run GitHub Actions, runs MLflow (expérience default-risk)</w:t>
+              <w:t xml:space="preserve">models/metrics.json, models/meta.json, notebook (matrice de confusion, courbe ROC, importance des variables), artefact « model » de chaque run GitHub Actions, runs MLflow (expérience default-risk)</w:t>
             </w:r>
           </w:p>
         </w:tc>

</xml_diff>